<commit_message>
feat: release AI Prompt Studio V1.4
</commit_message>
<xml_diff>
--- a/output/word/AI提示詞視覺化管理App_完整企劃書_精簡易讀版.docx
+++ b/output/word/AI提示詞視覺化管理App_完整企劃書_精簡易讀版.docx
@@ -49,7 +49,7 @@
           <w:color w:val="1F1F1F"/>
           <w:sz w:val="24"/>
         </w:rPr>
-        <w:t>把散落的 Prompt 集中管理，並在本機查看版本、Token 與 Agent 記憶。</w:t>
+        <w:t>把散落的 Prompt 集中管理，並在本機查看版本、Token、專案記憶與選用 AI 分析。</w:t>
       </w:r>
     </w:p>
     <w:p>
@@ -59,7 +59,7 @@
       <w:r>
         <w:drawing>
           <wp:inline xmlns:a="http://schemas.openxmlformats.org/drawingml/2006/main" xmlns:pic="http://schemas.openxmlformats.org/drawingml/2006/picture">
-            <wp:extent cx="5212080" cy="3438525"/>
+            <wp:extent cx="5212080" cy="5736907"/>
             <wp:docPr id="1" name="Picture 1"/>
             <wp:cNvGraphicFramePr>
               <a:graphicFrameLocks noChangeAspect="1"/>
@@ -68,7 +68,7 @@
               <a:graphicData uri="http://schemas.openxmlformats.org/drawingml/2006/picture">
                 <pic:pic>
                   <pic:nvPicPr>
-                    <pic:cNvPr id="0" name="01-prompt-workbench.png"/>
+                    <pic:cNvPr id="0" name="prompts-1440.png"/>
                     <pic:cNvPicPr/>
                   </pic:nvPicPr>
                   <pic:blipFill>
@@ -80,7 +80,7 @@
                   <pic:spPr>
                     <a:xfrm>
                       <a:off x="0" y="0"/>
-                      <a:ext cx="5212080" cy="3438525"/>
+                      <a:ext cx="5212080" cy="5736907"/>
                     </a:xfrm>
                     <a:prstGeom prst="rect"/>
                   </pic:spPr>
@@ -120,7 +120,7 @@
           <w:color w:val="666666"/>
           <w:sz w:val="19"/>
         </w:rPr>
-        <w:t>版本 2.0　2026 年 10 月</w:t>
+        <w:t>版本 V1.4　2026 年 10 月</w:t>
       </w:r>
     </w:p>
     <w:p>
@@ -148,7 +148,7 @@
           <w:color w:val="1F1F1F"/>
           <w:sz w:val="24"/>
         </w:rPr>
-        <w:t>這是一套給學生與個人開發者使用的本機工具。它把 Prompt 與 AI 記憶檔集中在專案中，減少找不到版本、內容重複與修改後無法復原的問題。</w:t>
+        <w:t>這是一套給學生與個人開發者使用的本機工具。它把 Prompt、Markdown 與 AI 記憶檔集中在專案中，減少找不到版本、檔案作用不清楚與修改後無法復原的問題。</w:t>
       </w:r>
     </w:p>
     <w:tbl>
@@ -345,7 +345,7 @@
                 <w:color w:val="1F1F1F"/>
                 <w:sz w:val="20"/>
               </w:rPr>
-              <w:t>用角色、任務、限制與輸出格式引導填寫</w:t>
+              <w:t>用範本、草稿與版本引導整理</w:t>
             </w:r>
           </w:p>
         </w:tc>
@@ -376,7 +376,7 @@
                 <w:color w:val="1F1F1F"/>
                 <w:sz w:val="20"/>
               </w:rPr>
-              <w:t>內容變長，卻看不到 Token 影響</w:t>
+              <w:t>內容變長，卻看不到輸入負擔</w:t>
             </w:r>
           </w:p>
         </w:tc>
@@ -405,7 +405,7 @@
                 <w:color w:val="1F1F1F"/>
                 <w:sz w:val="20"/>
               </w:rPr>
-              <w:t>在本機比較原文、候選與 Token 數</w:t>
+              <w:t>在本機顯示 Token 與用量等級</w:t>
             </w:r>
           </w:p>
         </w:tc>
@@ -465,7 +465,7 @@
                 <w:color w:val="1F1F1F"/>
                 <w:sz w:val="20"/>
               </w:rPr>
-              <w:t>顯示作用域，用表單產生內容並預覽 Diff</w:t>
+              <w:t>顯示檔案用途、資料夾分組與健檢問題</w:t>
             </w:r>
           </w:p>
         </w:tc>
@@ -669,7 +669,7 @@
                 <w:color w:val="1F1F1F"/>
                 <w:sz w:val="19"/>
               </w:rPr>
-              <w:t>檢查 Token</w:t>
+              <w:t>檢查負擔</w:t>
             </w:r>
           </w:p>
         </w:tc>
@@ -731,7 +731,7 @@
                 <w:color w:val="1F1F1F"/>
                 <w:sz w:val="19"/>
               </w:rPr>
-              <w:t>保存或匯出</w:t>
+              <w:t>保存版本</w:t>
             </w:r>
           </w:p>
         </w:tc>
@@ -754,7 +754,7 @@
           <w:color w:val="666666"/>
           <w:sz w:val="21"/>
         </w:rPr>
-        <w:t>核心功能離線運作，不需要 API Key。App 不會自動替使用者決定是否刪除內容，所有修改都能先預覽。</w:t>
+        <w:t>核心功能離線運作，不需要 API Key。Gemini 分析是選用功能，只有使用者確認後才會送出目前草稿。</w:t>
       </w:r>
     </w:p>
     <w:p>
@@ -1141,7 +1141,7 @@
                 <w:color w:val="1F1F1F"/>
                 <w:sz w:val="19"/>
               </w:rPr>
-              <w:t>查看檔案作用域與可能載入順序</w:t>
+              <w:t>查看檔案作用域、用途與健檢問題</w:t>
             </w:r>
           </w:p>
         </w:tc>
@@ -1157,7 +1157,7 @@
         <w:pStyle w:val="Heading2"/>
       </w:pPr>
       <w:r>
-        <w:t>這次要做到的四件事</w:t>
+        <w:t>V1.4 要做到的五件事</w:t>
       </w:r>
     </w:p>
     <w:p>
@@ -1191,7 +1191,7 @@
           <w:color w:val="1F1F1F"/>
           <w:sz w:val="21"/>
         </w:rPr>
-        <w:t>用結構化欄位協助初學者補齊必要資訊。</w:t>
+        <w:t>用內建範本與自己的範本協助建立草稿。</w:t>
       </w:r>
     </w:p>
     <w:p>
@@ -1208,7 +1208,7 @@
           <w:color w:val="1F1F1F"/>
           <w:sz w:val="21"/>
         </w:rPr>
-        <w:t>顯示純文字 Token、精簡候選與輸入成本情境。</w:t>
+        <w:t>顯示純文字 Token 與輸入負擔，不宣稱等於實際帳單。</w:t>
       </w:r>
     </w:p>
     <w:p>
@@ -1225,7 +1225,24 @@
           <w:color w:val="1F1F1F"/>
           <w:sz w:val="21"/>
         </w:rPr>
-        <w:t>安全管理 Agent 記憶檔，保留 Diff、備份與復原。</w:t>
+        <w:t>依核心記憶、專案提示詞、專案技能與 AI 輸出項目分組。</w:t>
+      </w:r>
+    </w:p>
+    <w:p>
+      <w:pPr>
+        <w:pStyle w:val="ListBullet"/>
+        <w:spacing w:after="80"/>
+        <w:ind w:left="397" w:hanging="170"/>
+      </w:pPr>
+      <w:r>
+        <w:rPr>
+          <w:rFonts w:ascii="Arial" w:hAnsi="Arial" w:eastAsia="PingFang TC"/>
+          <w:b w:val="0"/>
+          <w:i w:val="0"/>
+          <w:color w:val="1F1F1F"/>
+          <w:sz w:val="21"/>
+        </w:rPr>
+        <w:t>安全管理 Markdown，保留差異預覽、備份與外部修改檢查。</w:t>
       </w:r>
     </w:p>
     <w:p>
@@ -1248,7 +1265,7 @@
           <w:color w:val="1F1F1F"/>
           <w:sz w:val="21"/>
         </w:rPr>
-        <w:t>第一版不提供多人雲端協作，也不保證精簡後回答一定更好。規則式整理只處理可解釋的格式與重複內容，品質仍需實驗驗證。</w:t>
+        <w:t>V1.4 不提供多人雲端協作，不保證 AI 回答品質提升，也不會自動套用 Gemini 分析結果。所有檔案寫入仍需使用者預覽與確認。</w:t>
       </w:r>
     </w:p>
     <w:p>
@@ -1273,7 +1290,7 @@
       <w:r>
         <w:drawing>
           <wp:inline xmlns:a="http://schemas.openxmlformats.org/drawingml/2006/main" xmlns:pic="http://schemas.openxmlformats.org/drawingml/2006/picture">
-            <wp:extent cx="5897880" cy="3890962"/>
+            <wp:extent cx="5897880" cy="6491764"/>
             <wp:docPr id="2" name="Picture 2"/>
             <wp:cNvGraphicFramePr>
               <a:graphicFrameLocks noChangeAspect="1"/>
@@ -1282,7 +1299,7 @@
               <a:graphicData uri="http://schemas.openxmlformats.org/drawingml/2006/picture">
                 <pic:pic>
                   <pic:nvPicPr>
-                    <pic:cNvPr id="0" name="01-prompt-workbench.png"/>
+                    <pic:cNvPr id="0" name="prompts-1440.png"/>
                     <pic:cNvPicPr/>
                   </pic:nvPicPr>
                   <pic:blipFill>
@@ -1294,7 +1311,7 @@
                   <pic:spPr>
                     <a:xfrm>
                       <a:off x="0" y="0"/>
-                      <a:ext cx="5897880" cy="3890962"/>
+                      <a:ext cx="5897880" cy="6491764"/>
                     </a:xfrm>
                     <a:prstGeom prst="rect"/>
                   </pic:spPr>
@@ -1318,7 +1335,7 @@
           <w:color w:val="666666"/>
           <w:sz w:val="18"/>
         </w:rPr>
-        <w:t>圖 1　左側找 Prompt，中間編輯，右側比較 Token 與候選內容。</w:t>
+        <w:t>圖 1　提示詞工作台整合空白草稿、內建範本、已儲存提示詞與輸入負擔提示。</w:t>
       </w:r>
     </w:p>
     <w:tbl>
@@ -1426,7 +1443,7 @@
                 <w:color w:val="1F1F1F"/>
                 <w:sz w:val="20"/>
               </w:rPr>
-              <w:t>專案與搜尋</w:t>
+              <w:t>範本與群組</w:t>
             </w:r>
           </w:p>
         </w:tc>
@@ -1455,7 +1472,7 @@
                 <w:color w:val="1F1F1F"/>
                 <w:sz w:val="20"/>
               </w:rPr>
-              <w:t>用分類、標籤與關鍵字快速找回內容</w:t>
+              <w:t>建立空白草稿、套用內建範本，自己的範本可拖曳分類</w:t>
             </w:r>
           </w:p>
         </w:tc>
@@ -1486,7 +1503,7 @@
                 <w:color w:val="1F1F1F"/>
                 <w:sz w:val="20"/>
               </w:rPr>
-              <w:t>引導式編寫</w:t>
+              <w:t>版本紀錄</w:t>
             </w:r>
           </w:p>
         </w:tc>
@@ -1515,7 +1532,7 @@
                 <w:color w:val="1F1F1F"/>
                 <w:sz w:val="20"/>
               </w:rPr>
-              <w:t>提醒使用者填入角色、任務、限制與輸出格式</w:t>
+              <w:t>每次儲存建立新版本，可帶回舊內容再編輯</w:t>
             </w:r>
           </w:p>
         </w:tc>
@@ -1546,7 +1563,7 @@
                 <w:color w:val="1F1F1F"/>
                 <w:sz w:val="20"/>
               </w:rPr>
-              <w:t>版本紀錄</w:t>
+              <w:t>輸入負擔</w:t>
             </w:r>
           </w:p>
         </w:tc>
@@ -1575,7 +1592,7 @@
                 <w:color w:val="1F1F1F"/>
                 <w:sz w:val="20"/>
               </w:rPr>
-              <w:t>每次儲存建立新版本，可帶回舊內容再編輯</w:t>
+              <w:t>顯示 Token 與低、中、高等級，不把估算當完整帳單</w:t>
             </w:r>
           </w:p>
         </w:tc>
@@ -1606,7 +1623,7 @@
                 <w:color w:val="1F1F1F"/>
                 <w:sz w:val="20"/>
               </w:rPr>
-              <w:t>Token 分析</w:t>
+              <w:t>選用 AI</w:t>
             </w:r>
           </w:p>
         </w:tc>
@@ -1635,7 +1652,7 @@
                 <w:color w:val="1F1F1F"/>
                 <w:sz w:val="20"/>
               </w:rPr>
-              <w:t>比較原文與候選，不把純文字 Token 當成完整帳單</w:t>
+              <w:t>使用者同意後才送出草稿給 Gemini 分析</w:t>
             </w:r>
           </w:p>
         </w:tc>
@@ -1656,7 +1673,7 @@
         <w:pStyle w:val="Heading1"/>
       </w:pPr>
       <w:r>
-        <w:t>主要功能二 專案與記憶編程</w:t>
+        <w:t>主要功能二 專案檔案與章節編輯</w:t>
       </w:r>
     </w:p>
     <w:p>
@@ -1668,7 +1685,7 @@
       <w:r>
         <w:drawing>
           <wp:inline xmlns:a="http://schemas.openxmlformats.org/drawingml/2006/main" xmlns:pic="http://schemas.openxmlformats.org/drawingml/2006/picture">
-            <wp:extent cx="5394960" cy="3559175"/>
+            <wp:extent cx="5394960" cy="4267264"/>
             <wp:docPr id="3" name="Picture 3"/>
             <wp:cNvGraphicFramePr>
               <a:graphicFrameLocks noChangeAspect="1"/>
@@ -1677,7 +1694,7 @@
               <a:graphicData uri="http://schemas.openxmlformats.org/drawingml/2006/picture">
                 <pic:pic>
                   <pic:nvPicPr>
-                    <pic:cNvPr id="0" name="02-project-map.png"/>
+                    <pic:cNvPr id="0" name="projects-1440.png"/>
                     <pic:cNvPicPr/>
                   </pic:nvPicPr>
                   <pic:blipFill>
@@ -1689,7 +1706,7 @@
                   <pic:spPr>
                     <a:xfrm>
                       <a:off x="0" y="0"/>
-                      <a:ext cx="5394960" cy="3559175"/>
+                      <a:ext cx="5394960" cy="4267264"/>
                     </a:xfrm>
                     <a:prstGeom prst="rect"/>
                   </pic:spPr>
@@ -1713,7 +1730,7 @@
           <w:color w:val="666666"/>
           <w:sz w:val="18"/>
         </w:rPr>
-        <w:t>圖 2　先確認專案裡有哪些 Markdown，以及哪些檔案會被 Agent 使用。</w:t>
+        <w:t>圖 2　專案檔案依核心記憶、專案提示詞、專案技能與 AI 輸出項目分組。</w:t>
       </w:r>
     </w:p>
     <w:p>
@@ -1725,7 +1742,7 @@
       <w:r>
         <w:drawing>
           <wp:inline xmlns:a="http://schemas.openxmlformats.org/drawingml/2006/main" xmlns:pic="http://schemas.openxmlformats.org/drawingml/2006/picture">
-            <wp:extent cx="5394960" cy="3559175"/>
+            <wp:extent cx="5394960" cy="4267264"/>
             <wp:docPr id="4" name="Picture 4"/>
             <wp:cNvGraphicFramePr>
               <a:graphicFrameLocks noChangeAspect="1"/>
@@ -1734,7 +1751,7 @@
               <a:graphicData uri="http://schemas.openxmlformats.org/drawingml/2006/picture">
                 <pic:pic>
                   <pic:nvPicPr>
-                    <pic:cNvPr id="0" name="03-memory-programming.png"/>
+                    <pic:cNvPr id="0" name="editor-1440.png"/>
                     <pic:cNvPicPr/>
                   </pic:nvPicPr>
                   <pic:blipFill>
@@ -1746,7 +1763,7 @@
                   <pic:spPr>
                     <a:xfrm>
                       <a:off x="0" y="0"/>
-                      <a:ext cx="5394960" cy="3559175"/>
+                      <a:ext cx="5394960" cy="4267264"/>
                     </a:xfrm>
                     <a:prstGeom prst="rect"/>
                   </pic:spPr>
@@ -1770,7 +1787,7 @@
           <w:color w:val="666666"/>
           <w:sz w:val="18"/>
         </w:rPr>
-        <w:t>圖 3　左側填寫結構化欄位，右側先看 Markdown 與 Diff，再決定是否寫入。</w:t>
+        <w:t>圖 3　編輯器可改章節、新增章節或進階全文修改，儲存前先看差異。</w:t>
       </w:r>
     </w:p>
     <w:p>
@@ -1785,7 +1802,7 @@
           <w:color w:val="666666"/>
           <w:sz w:val="21"/>
         </w:rPr>
-        <w:t>第一版正式支援 Codex、Claude Code、Gemini CLI 與 OpenClaw。一般 Markdown 仍可查看，但不會被誤標成 Agent 自動記憶。</w:t>
+        <w:t>一般 Markdown 可以查看與編輯，但不會被誤標成 Agent 自動記憶。企劃書、規格、展示指南與交付紀錄會集中到 AI 輸出項目。</w:t>
       </w:r>
     </w:p>
     <w:p>
@@ -1810,7 +1827,7 @@
       <w:r>
         <w:drawing>
           <wp:inline xmlns:a="http://schemas.openxmlformats.org/drawingml/2006/main" xmlns:pic="http://schemas.openxmlformats.org/drawingml/2006/picture">
-            <wp:extent cx="5394960" cy="3559175"/>
+            <wp:extent cx="5394960" cy="4016248"/>
             <wp:docPr id="5" name="Picture 5"/>
             <wp:cNvGraphicFramePr>
               <a:graphicFrameLocks noChangeAspect="1"/>
@@ -1819,7 +1836,7 @@
               <a:graphicData uri="http://schemas.openxmlformats.org/drawingml/2006/picture">
                 <pic:pic>
                   <pic:nvPicPr>
-                    <pic:cNvPr id="0" name="04-memory-health.png"/>
+                    <pic:cNvPr id="0" name="health-1440.png"/>
                     <pic:cNvPicPr/>
                   </pic:nvPicPr>
                   <pic:blipFill>
@@ -1831,7 +1848,7 @@
                   <pic:spPr>
                     <a:xfrm>
                       <a:off x="0" y="0"/>
-                      <a:ext cx="5394960" cy="3559175"/>
+                      <a:ext cx="5394960" cy="4016248"/>
                     </a:xfrm>
                     <a:prstGeom prst="rect"/>
                   </pic:spPr>
@@ -1855,7 +1872,7 @@
           <w:color w:val="666666"/>
           <w:sz w:val="18"/>
         </w:rPr>
-        <w:t>圖 4　健檢顯示錯誤檔名、疑似敏感資料、內容長度與載入順序。</w:t>
+        <w:t>圖 4　健檢依資料夾分組，右側以卡片顯示行號、類型與問題內容。</w:t>
       </w:r>
     </w:p>
     <w:p>
@@ -1867,7 +1884,7 @@
       <w:r>
         <w:drawing>
           <wp:inline xmlns:a="http://schemas.openxmlformats.org/drawingml/2006/main" xmlns:pic="http://schemas.openxmlformats.org/drawingml/2006/picture">
-            <wp:extent cx="5394960" cy="3559175"/>
+            <wp:extent cx="5394960" cy="6080570"/>
             <wp:docPr id="6" name="Picture 6"/>
             <wp:cNvGraphicFramePr>
               <a:graphicFrameLocks noChangeAspect="1"/>
@@ -1876,7 +1893,7 @@
               <a:graphicData uri="http://schemas.openxmlformats.org/drawingml/2006/picture">
                 <pic:pic>
                   <pic:nvPicPr>
-                    <pic:cNvPr id="0" name="05-settings-sources.png"/>
+                    <pic:cNvPr id="0" name="settings-1440.png"/>
                     <pic:cNvPicPr/>
                   </pic:nvPicPr>
                   <pic:blipFill>
@@ -1888,7 +1905,7 @@
                   <pic:spPr>
                     <a:xfrm>
                       <a:off x="0" y="0"/>
-                      <a:ext cx="5394960" cy="3559175"/>
+                      <a:ext cx="5394960" cy="6080570"/>
                     </a:xfrm>
                     <a:prstGeom prst="rect"/>
                   </pic:spPr>
@@ -1912,7 +1929,7 @@
           <w:color w:val="666666"/>
           <w:sz w:val="18"/>
         </w:rPr>
-        <w:t>圖 5　設定頁列出支援工具、規格版本、查證日期與官方來源。</w:t>
+        <w:t>圖 5　設定頁顯示版本、API 狀態、Gemini Key 設定與規格來源。</w:t>
       </w:r>
     </w:p>
     <w:p>
@@ -1927,7 +1944,7 @@
           <w:color w:val="666666"/>
           <w:sz w:val="21"/>
         </w:rPr>
-        <w:t>健檢只提出問題，不會自動修改檔案。規格資料內建在 App 中，離線也能使用。</w:t>
+        <w:t>健檢只提出問題，不會自動修改檔案。Gemini API Key 只保存在目前 macOS 使用者的 App Support 私有檔。</w:t>
       </w:r>
     </w:p>
     <w:p>
@@ -2314,7 +2331,7 @@
                 <w:color w:val="1F1F1F"/>
                 <w:sz w:val="19"/>
               </w:rPr>
-              <w:t>掃描專案、Token 計數、編譯、Diff 與檔案寫回</w:t>
+              <w:t>掃描專案、Token 計數、健檢、Diff 與檔案寫回</w:t>
             </w:r>
           </w:p>
         </w:tc>
@@ -2374,7 +2391,7 @@
                 <w:color w:val="1F1F1F"/>
                 <w:sz w:val="19"/>
               </w:rPr>
-              <w:t>SQLite 與 Markdown</w:t>
+              <w:t>SQLite、Markdown、本機私有設定</w:t>
             </w:r>
           </w:p>
         </w:tc>
@@ -2403,7 +2420,7 @@
                 <w:color w:val="1F1F1F"/>
                 <w:sz w:val="19"/>
               </w:rPr>
-              <w:t>保存 Prompt、版本、變更紀錄與專案檔案</w:t>
+              <w:t>保存 Prompt、版本、群組、專案檔案與 API Key 狀態</w:t>
             </w:r>
           </w:p>
         </w:tc>
@@ -2768,7 +2785,7 @@
           <w:color w:val="1F1F1F"/>
           <w:sz w:val="21"/>
         </w:rPr>
-        <w:t>App 顯示選定 tokenizer 的純文字 Token。成本由使用者填入單價與呼叫次數後推算，不包含輸出、圖片、工具、快取、重試與稅。</w:t>
+        <w:t>App 顯示選定 tokenizer 的純文字 Token 與輸入負擔等級。它沒有連接帳號額度、重置時間或完整帳單，因此不能宣稱一定省錢或一定夠用。</w:t>
       </w:r>
     </w:p>
     <w:p>
@@ -3548,7 +3565,7 @@
           <w:color w:val="666666"/>
           <w:sz w:val="21"/>
         </w:rPr>
-        <w:t>目前已完成工程測試與合成文本 Token 測量。真人可用性研究及模型輸出品質比較尚未執行，因此文件不宣稱已證明節省比例或品質等效。</w:t>
+        <w:t>目前已完成工程測試與 V1.4 Web/桌面 smoke test。真人可用性研究及模型輸出品質比較尚未執行，因此文件不宣稱已證明節省比例或品質等效。</w:t>
       </w:r>
     </w:p>
     <w:p>
@@ -3698,7 +3715,7 @@
                 <w:color w:val="1F1F1F"/>
                 <w:sz w:val="20"/>
               </w:rPr>
-              <w:t>共用 Web UI、macOS App、Prompt 工作台、記憶編程、健檢、SQLite、Token 分析與安全寫回</w:t>
+              <w:t>共用 Web UI、macOS App、Prompt 工作台、群組、章節編輯、健檢、Gemini 設定與安全寫回</w:t>
             </w:r>
           </w:p>
         </w:tc>
@@ -3758,7 +3775,7 @@
                 <w:color w:val="1F1F1F"/>
                 <w:sz w:val="20"/>
               </w:rPr>
-              <w:t>23 項自動測試、桌面 self-test、操作截圖、Word 與 PDF 文件</w:t>
+              <w:t>52 項 Python 測試、V1.4 Web/桌面 smoke test、操作截圖、Word 與 PDF 文件</w:t>
             </w:r>
           </w:p>
         </w:tc>
@@ -3818,7 +3835,7 @@
                 <w:color w:val="1F1F1F"/>
                 <w:sz w:val="20"/>
               </w:rPr>
-              <w:t>真人可用性研究、模型品質比較、正式報告、簡報與展示影片</w:t>
+              <w:t>真人可用性研究、真實 Gemini API 帳號驗證、模型品質比較、正式報告與展示影片</w:t>
             </w:r>
           </w:p>
         </w:tc>
@@ -4119,7 +4136,7 @@
                 <w:color w:val="1F1F1F"/>
                 <w:sz w:val="19"/>
               </w:rPr>
-              <w:t>可操作 App</w:t>
+              <w:t>V1.4 可操作 App</w:t>
             </w:r>
           </w:p>
         </w:tc>
@@ -4961,7 +4978,7 @@
           <w:color w:val="1F1F1F"/>
           <w:sz w:val="22"/>
         </w:rPr>
-        <w:t>本專題以專案為單位管理 Prompt，提供引導式編寫、搜尋、版本、Token 分析與 Markdown 匯出，也能查看 Agent 記憶檔的作用範圍並安全寫回。目前已有可操作原型，下一步會用實驗確認整理效率、Token 變化與輸出品質。</w:t>
+        <w:t>本專題以專案為單位管理 Prompt，提供範本、搜尋、版本、Token 輸入負擔、Markdown 章節編輯與記憶健檢，也能選用 Gemini 做草稿分析。目前已有 V1.4 可操作版本，下一步會用實驗確認整理效率、Token 變化與輸出品質。</w:t>
       </w:r>
     </w:p>
     <w:p>
@@ -4984,7 +5001,7 @@
           <w:color w:val="666666"/>
           <w:sz w:val="21"/>
         </w:rPr>
-        <w:t>以下資料用於企劃結構、需求規格、Prompt 管理與 Token 計數方法。查閱日期為 2026 年 9 月 25 日。</w:t>
+        <w:t>以下資料用於企劃結構、需求規格、Prompt 管理、Token 計數與 API 安全邊界。查閱日期為 2026 年 10 月 8 日。</w:t>
       </w:r>
     </w:p>
     <w:p>
@@ -5001,7 +5018,7 @@
           <w:color w:val="1F1F1F"/>
           <w:sz w:val="20"/>
         </w:rPr>
-        <w:t>S1 國科會大專學生研究計畫申請表 清華大學公開版本</w:t>
+        <w:t>S1 Langfuse Prompt Management</w:t>
       </w:r>
     </w:p>
     <w:p>
@@ -5018,7 +5035,7 @@
           <w:color w:val="1F1F1F"/>
           <w:sz w:val="20"/>
         </w:rPr>
-        <w:t>S2 CMU Project Proposal Guidelines</w:t>
+        <w:t>S2 Promptfoo Introduction</w:t>
       </w:r>
     </w:p>
     <w:p>
@@ -5035,7 +5052,7 @@
           <w:color w:val="1F1F1F"/>
           <w:sz w:val="20"/>
         </w:rPr>
-        <w:t>S3 ISO IEC IEEE 29148 2018 公開介紹</w:t>
+        <w:t>S3 OpenAI tiktoken</w:t>
       </w:r>
     </w:p>
     <w:p>
@@ -5052,7 +5069,7 @@
           <w:color w:val="1F1F1F"/>
           <w:sz w:val="20"/>
         </w:rPr>
-        <w:t>S4 Langfuse Prompt Management</w:t>
+        <w:t>S4 Gemini API Pricing</w:t>
       </w:r>
     </w:p>
     <w:p>
@@ -5069,7 +5086,7 @@
           <w:color w:val="1F1F1F"/>
           <w:sz w:val="20"/>
         </w:rPr>
-        <w:t>S5 Promptfoo Introduction</w:t>
+        <w:t>S5 Gemini API Key Guide</w:t>
       </w:r>
     </w:p>
     <w:p>
@@ -5086,7 +5103,7 @@
           <w:color w:val="1F1F1F"/>
           <w:sz w:val="20"/>
         </w:rPr>
-        <w:t>S6 OpenAI tiktoken</w:t>
+        <w:t>S6 OWASP Prompt Injection Prevention Cheat Sheet</w:t>
       </w:r>
     </w:p>
     <w:p>
@@ -5103,41 +5120,7 @@
           <w:color w:val="1F1F1F"/>
           <w:sz w:val="20"/>
         </w:rPr>
-        <w:t>S7 Anthropic Token Counting</w:t>
-      </w:r>
-    </w:p>
-    <w:p>
-      <w:pPr>
-        <w:pStyle w:val="ListBullet"/>
-        <w:spacing w:after="40"/>
-        <w:ind w:left="397" w:hanging="170"/>
-      </w:pPr>
-      <w:r>
-        <w:rPr>
-          <w:rFonts w:ascii="Arial" w:hAnsi="Arial" w:eastAsia="PingFang TC"/>
-          <w:b w:val="0"/>
-          <w:i w:val="0"/>
-          <w:color w:val="1F1F1F"/>
-          <w:sz w:val="20"/>
-        </w:rPr>
-        <w:t>S8 國立東華大學資訊管理學系專題製作相關規定</w:t>
-      </w:r>
-    </w:p>
-    <w:p>
-      <w:pPr>
-        <w:pStyle w:val="ListBullet"/>
-        <w:spacing w:after="40"/>
-        <w:ind w:left="397" w:hanging="170"/>
-      </w:pPr>
-      <w:r>
-        <w:rPr>
-          <w:rFonts w:ascii="Arial" w:hAnsi="Arial" w:eastAsia="PingFang TC"/>
-          <w:b w:val="0"/>
-          <w:i w:val="0"/>
-          <w:color w:val="1F1F1F"/>
-          <w:sz w:val="20"/>
-        </w:rPr>
-        <w:t>S9 南臺科技大學軟體工程教材 軟體需求規格書格式範例</w:t>
+        <w:t>S7 ISO IEC IEEE 29148 2018 公開介紹</w:t>
       </w:r>
     </w:p>
     <w:p>
@@ -5160,7 +5143,7 @@
           <w:color w:val="8B513A"/>
           <w:sz w:val="24"/>
         </w:rPr>
-        <w:t>AI Prompt Studio 把 Prompt 與 Agent 記憶從散落文字，整理成可以搜尋、比較、預覽、備份與復原的本機工作流程。</w:t>
+        <w:t>AI Prompt Studio Next V1.4 把 Prompt、Markdown 與 Agent 記憶整理成可以搜尋、分類、預覽、健檢、備份與復原的本機工作流程。</w:t>
       </w:r>
     </w:p>
     <w:sectPr>

</xml_diff>